<commit_message>
New drinks have been added to the product menu, and the first working version of STT has been implemented via Yandex SpeechKit
</commit_message>
<xml_diff>
--- a/docs/About_project/Explanatory_note_AI_Cha.docx
+++ b/docs/About_project/Explanatory_note_AI_Cha.docx
@@ -82,15 +82,6 @@
           <w:lang w:val="ru-RU"/>
         </w:rPr>
       </w:pPr>
-      <w:r>
-        <w:rPr>
-          <w:rFonts w:ascii="Times New Roman" w:hAnsi="Times New Roman" w:cs="Times New Roman"/>
-          <w:sz w:val="28"/>
-          <w:szCs w:val="28"/>
-          <w:lang w:val="ru-RU"/>
-        </w:rPr>
-        <w:t>Российский технологический университет МИРЭА, Детский технопарк «Альтаир»</w:t>
-      </w:r>
     </w:p>
     <w:p>
       <w:pPr>
@@ -134,18 +125,6 @@
         <w:jc w:val="center"/>
         <w:rPr>
           <w:rFonts w:ascii="Times New Roman" w:hAnsi="Times New Roman" w:cs="Times New Roman"/>
-          <w:sz w:val="28"/>
-          <w:szCs w:val="28"/>
-          <w:lang w:val="ru-RU"/>
-        </w:rPr>
-      </w:pPr>
-    </w:p>
-    <w:p>
-      <w:pPr>
-        <w:spacing w:line="360" w:lineRule="auto"/>
-        <w:jc w:val="center"/>
-        <w:rPr>
-          <w:rFonts w:ascii="Times New Roman" w:hAnsi="Times New Roman" w:cs="Times New Roman"/>
           <w:sz w:val="32"/>
           <w:szCs w:val="32"/>
           <w:lang w:val="ru-RU"/>
@@ -154,70 +133,28 @@
       <w:r>
         <w:rPr>
           <w:rFonts w:ascii="Times New Roman" w:hAnsi="Times New Roman" w:cs="Times New Roman"/>
-          <w:sz w:val="32"/>
-          <w:szCs w:val="32"/>
-          <w:lang w:val="ru-RU"/>
-        </w:rPr>
-        <w:t xml:space="preserve">Отчёт </w:t>
-      </w:r>
-    </w:p>
-    <w:p>
-      <w:pPr>
-        <w:spacing w:line="360" w:lineRule="auto"/>
-        <w:jc w:val="center"/>
-        <w:rPr>
-          <w:rFonts w:ascii="Times New Roman" w:hAnsi="Times New Roman" w:cs="Times New Roman"/>
-          <w:sz w:val="32"/>
-          <w:szCs w:val="32"/>
-          <w:lang w:val="ru-RU"/>
-        </w:rPr>
-      </w:pPr>
-      <w:r>
-        <w:rPr>
-          <w:rFonts w:ascii="Times New Roman" w:hAnsi="Times New Roman" w:cs="Times New Roman"/>
-          <w:sz w:val="32"/>
-          <w:szCs w:val="32"/>
-          <w:lang w:val="ru-RU"/>
-        </w:rPr>
-        <w:t>о научно-исследовательской работе по теме:</w:t>
-      </w:r>
-    </w:p>
-    <w:p>
-      <w:pPr>
-        <w:spacing w:line="360" w:lineRule="auto"/>
-        <w:jc w:val="center"/>
-        <w:rPr>
-          <w:rFonts w:ascii="Times New Roman" w:hAnsi="Times New Roman" w:cs="Times New Roman"/>
-          <w:sz w:val="32"/>
-          <w:szCs w:val="32"/>
-          <w:lang w:val="ru-RU"/>
-        </w:rPr>
-      </w:pPr>
-      <w:r>
-        <w:rPr>
-          <w:rFonts w:ascii="Times New Roman" w:hAnsi="Times New Roman" w:cs="Times New Roman"/>
           <w:sz w:val="40"/>
           <w:szCs w:val="40"/>
           <w:lang w:val="ru-RU"/>
         </w:rPr>
-        <w:t>Разработка интеллектуальной P</w:t>
+        <w:t>Р</w:t>
       </w:r>
       <w:r>
         <w:rPr>
           <w:rFonts w:ascii="Times New Roman" w:hAnsi="Times New Roman" w:cs="Times New Roman"/>
           <w:sz w:val="40"/>
           <w:szCs w:val="40"/>
-        </w:rPr>
-        <w:t>OS</w:t>
+          <w:lang w:val="ru-RU"/>
+        </w:rPr>
+        <w:t>АЗРАБОТКА СИСТЕМЫ НА ОСНОВЕ ИССКУССТВЕННОГО ИНТЕЛЛЕКТА ДЛЯ ОФОРМЛЕНИЯ ЗАКАЗОВ В КАФЕ «A</w:t>
       </w:r>
       <w:r>
         <w:rPr>
           <w:rFonts w:ascii="Times New Roman" w:hAnsi="Times New Roman" w:cs="Times New Roman"/>
           <w:sz w:val="40"/>
           <w:szCs w:val="40"/>
-          <w:lang w:val="ru-RU"/>
-        </w:rPr>
-        <w:t>-системы</w:t>
+        </w:rPr>
+        <w:t>I</w:t>
       </w:r>
       <w:r>
         <w:rPr>
@@ -226,59 +163,15 @@
           <w:szCs w:val="40"/>
           <w:lang w:val="ru-RU"/>
         </w:rPr>
-        <w:t xml:space="preserve"> на основе искусственного интеллекта</w:t>
+        <w:t xml:space="preserve"> </w:t>
       </w:r>
       <w:r>
         <w:rPr>
           <w:rFonts w:ascii="Times New Roman" w:hAnsi="Times New Roman" w:cs="Times New Roman"/>
           <w:sz w:val="40"/>
           <w:szCs w:val="40"/>
-          <w:lang w:val="ru-RU"/>
-        </w:rPr>
-        <w:t xml:space="preserve"> для оформления заказов в кафе </w:t>
-      </w:r>
-      <w:r>
-        <w:rPr>
-          <w:rFonts w:ascii="Times New Roman" w:hAnsi="Times New Roman" w:cs="Times New Roman"/>
-          <w:sz w:val="40"/>
-          <w:szCs w:val="40"/>
-          <w:lang w:val="ru-RU"/>
-        </w:rPr>
-        <w:t>«</w:t>
-      </w:r>
-      <w:r>
-        <w:rPr>
-          <w:rFonts w:ascii="Times New Roman" w:hAnsi="Times New Roman" w:cs="Times New Roman"/>
-          <w:sz w:val="40"/>
-          <w:szCs w:val="40"/>
-          <w:lang w:val="ru-RU"/>
-        </w:rPr>
-        <w:t>A</w:t>
-      </w:r>
-      <w:r>
-        <w:rPr>
-          <w:rFonts w:ascii="Times New Roman" w:hAnsi="Times New Roman" w:cs="Times New Roman"/>
-          <w:sz w:val="40"/>
-          <w:szCs w:val="40"/>
-        </w:rPr>
-        <w:t>I</w:t>
-      </w:r>
-      <w:r>
-        <w:rPr>
-          <w:rFonts w:ascii="Times New Roman" w:hAnsi="Times New Roman" w:cs="Times New Roman"/>
-          <w:sz w:val="40"/>
-          <w:szCs w:val="40"/>
-          <w:lang w:val="ru-RU"/>
-        </w:rPr>
-        <w:t xml:space="preserve"> </w:t>
-      </w:r>
-      <w:r>
-        <w:rPr>
-          <w:rFonts w:ascii="Times New Roman" w:hAnsi="Times New Roman" w:cs="Times New Roman"/>
-          <w:sz w:val="40"/>
-          <w:szCs w:val="40"/>
-        </w:rPr>
-        <w:t>Cha</w:t>
+        </w:rPr>
+        <w:t>CHA</w:t>
       </w:r>
       <w:r>
         <w:rPr>
@@ -342,66 +235,13 @@
         <w:wordWrap w:val="0"/>
         <w:spacing w:line="360" w:lineRule="auto"/>
         <w:ind w:left="2124" w:firstLineChars="403" w:firstLine="1150"/>
-        <w:jc w:val="right"/>
+        <w:jc w:val="both"/>
         <w:rPr>
           <w:rFonts w:ascii="Times New Roman" w:hAnsi="Times New Roman" w:cs="Times New Roman"/>
           <w:b/>
           <w:bCs/>
           <w:sz w:val="28"/>
           <w:szCs w:val="28"/>
-          <w:lang w:val="ru-RU"/>
-        </w:rPr>
-      </w:pPr>
-      <w:r>
-        <w:rPr>
-          <w:rFonts w:ascii="Times New Roman" w:hAnsi="Times New Roman" w:cs="Times New Roman"/>
-          <w:b/>
-          <w:bCs/>
-          <w:sz w:val="28"/>
-          <w:szCs w:val="28"/>
-          <w:lang w:val="ru-RU"/>
-        </w:rPr>
-        <w:t>Автор проекта: Котов Иван Андреевич</w:t>
-      </w:r>
-    </w:p>
-    <w:p>
-      <w:pPr>
-        <w:wordWrap w:val="0"/>
-        <w:spacing w:line="360" w:lineRule="auto"/>
-        <w:ind w:left="2124" w:firstLineChars="403" w:firstLine="1150"/>
-        <w:jc w:val="right"/>
-        <w:rPr>
-          <w:rFonts w:ascii="Times New Roman" w:hAnsi="Times New Roman" w:cs="Times New Roman"/>
-          <w:b/>
-          <w:bCs/>
-          <w:sz w:val="28"/>
-          <w:szCs w:val="28"/>
-          <w:lang w:val="ru-RU"/>
-        </w:rPr>
-      </w:pPr>
-      <w:r>
-        <w:rPr>
-          <w:rFonts w:ascii="Times New Roman" w:hAnsi="Times New Roman" w:cs="Times New Roman"/>
-          <w:b/>
-          <w:bCs/>
-          <w:sz w:val="28"/>
-          <w:szCs w:val="28"/>
-          <w:lang w:val="ru-RU"/>
-        </w:rPr>
-        <w:t>Учащийся 10Т класса</w:t>
-      </w:r>
-    </w:p>
-    <w:p>
-      <w:pPr>
-        <w:spacing w:line="360" w:lineRule="auto"/>
-        <w:jc w:val="right"/>
-        <w:rPr>
-          <w:rFonts w:ascii="Times New Roman" w:hAnsi="Times New Roman" w:cs="Times New Roman"/>
-          <w:b/>
-          <w:bCs/>
-          <w:sz w:val="28"/>
-          <w:szCs w:val="28"/>
-          <w:lang w:val="ru-RU"/>
         </w:rPr>
       </w:pPr>
     </w:p>
@@ -420,41 +260,6 @@
           <w:lang w:val="ru-RU"/>
         </w:rPr>
       </w:pPr>
-      <w:r>
-        <w:rPr>
-          <w:rFonts w:ascii="Times New Roman" w:hAnsi="Times New Roman" w:cs="Times New Roman"/>
-          <w:b/>
-          <w:bCs/>
-          <w:sz w:val="28"/>
-          <w:szCs w:val="28"/>
-          <w:lang w:val="ru-RU"/>
-        </w:rPr>
-        <w:t xml:space="preserve">Научный руководитель: </w:t>
-      </w:r>
-      <w:proofErr w:type="spellStart"/>
-      <w:r>
-        <w:rPr>
-          <w:rFonts w:ascii="Times New Roman" w:hAnsi="Times New Roman" w:cs="Times New Roman"/>
-          <w:b/>
-          <w:bCs/>
-          <w:sz w:val="28"/>
-          <w:szCs w:val="28"/>
-          <w:lang w:val="ru-RU"/>
-        </w:rPr>
-        <w:t>Ирицкий</w:t>
-      </w:r>
-      <w:proofErr w:type="spellEnd"/>
-      <w:r>
-        <w:rPr>
-          <w:rFonts w:ascii="Times New Roman" w:hAnsi="Times New Roman" w:cs="Times New Roman"/>
-          <w:b/>
-          <w:bCs/>
-          <w:sz w:val="28"/>
-          <w:szCs w:val="28"/>
-          <w:lang w:val="ru-RU"/>
-        </w:rPr>
-        <w:t xml:space="preserve"> Александр Игоревич,</w:t>
-      </w:r>
     </w:p>
     <w:p>
       <w:pPr>
@@ -471,17 +276,6 @@
           <w:lang w:val="ru-RU"/>
         </w:rPr>
       </w:pPr>
-      <w:r>
-        <w:rPr>
-          <w:rFonts w:ascii="Times New Roman" w:hAnsi="Times New Roman" w:cs="Times New Roman"/>
-          <w:b/>
-          <w:bCs/>
-          <w:sz w:val="28"/>
-          <w:szCs w:val="28"/>
-          <w:lang w:val="ru-RU"/>
-        </w:rPr>
-        <w:t>Преподаватель ДТ «Альтаир» РТУ МИРЭА</w:t>
-      </w:r>
     </w:p>
     <w:p>
       <w:pPr>
@@ -549,6 +343,54 @@
     </w:p>
     <w:p>
       <w:pPr>
+        <w:wordWrap w:val="0"/>
+        <w:spacing w:line="360" w:lineRule="auto"/>
+        <w:ind w:firstLineChars="600" w:firstLine="1713"/>
+        <w:jc w:val="right"/>
+        <w:rPr>
+          <w:rFonts w:ascii="Times New Roman" w:hAnsi="Times New Roman" w:cs="Times New Roman"/>
+          <w:b/>
+          <w:bCs/>
+          <w:sz w:val="28"/>
+          <w:szCs w:val="28"/>
+          <w:lang w:val="ru-RU"/>
+        </w:rPr>
+      </w:pPr>
+    </w:p>
+    <w:p>
+      <w:pPr>
+        <w:wordWrap w:val="0"/>
+        <w:spacing w:line="360" w:lineRule="auto"/>
+        <w:ind w:firstLineChars="600" w:firstLine="1713"/>
+        <w:jc w:val="right"/>
+        <w:rPr>
+          <w:rFonts w:ascii="Times New Roman" w:hAnsi="Times New Roman" w:cs="Times New Roman"/>
+          <w:b/>
+          <w:bCs/>
+          <w:sz w:val="28"/>
+          <w:szCs w:val="28"/>
+          <w:lang w:val="ru-RU"/>
+        </w:rPr>
+      </w:pPr>
+    </w:p>
+    <w:p>
+      <w:pPr>
+        <w:wordWrap w:val="0"/>
+        <w:spacing w:line="360" w:lineRule="auto"/>
+        <w:ind w:firstLineChars="600" w:firstLine="1713"/>
+        <w:jc w:val="right"/>
+        <w:rPr>
+          <w:rFonts w:ascii="Times New Roman" w:hAnsi="Times New Roman" w:cs="Times New Roman"/>
+          <w:b/>
+          <w:bCs/>
+          <w:sz w:val="28"/>
+          <w:szCs w:val="28"/>
+          <w:lang w:val="ru-RU"/>
+        </w:rPr>
+      </w:pPr>
+    </w:p>
+    <w:p>
+      <w:pPr>
         <w:spacing w:line="360" w:lineRule="auto"/>
         <w:jc w:val="center"/>
         <w:rPr>
@@ -595,7 +437,6 @@
           <w:szCs w:val="28"/>
           <w:lang w:val="ru-RU"/>
         </w:rPr>
-        <w:lastRenderedPageBreak/>
         <w:t>СОДЕРЖАНИЕ</w:t>
       </w:r>
     </w:p>
@@ -735,6 +576,7 @@
           <w:szCs w:val="28"/>
           <w:lang w:val="ru-RU"/>
         </w:rPr>
+        <w:lastRenderedPageBreak/>
         <w:t xml:space="preserve">Исследование проблемы .................................................................... </w:t>
       </w:r>
       <w:r>
@@ -1365,6 +1207,51 @@
     </w:p>
     <w:p>
       <w:pPr>
+        <w:rPr>
+          <w:sz w:val="36"/>
+          <w:szCs w:val="36"/>
+          <w:lang w:val="ru-RU"/>
+        </w:rPr>
+      </w:pPr>
+    </w:p>
+    <w:p>
+      <w:pPr>
+        <w:rPr>
+          <w:sz w:val="36"/>
+          <w:szCs w:val="36"/>
+          <w:lang w:val="ru-RU"/>
+        </w:rPr>
+      </w:pPr>
+    </w:p>
+    <w:p>
+      <w:pPr>
+        <w:rPr>
+          <w:sz w:val="36"/>
+          <w:szCs w:val="36"/>
+          <w:lang w:val="ru-RU"/>
+        </w:rPr>
+      </w:pPr>
+    </w:p>
+    <w:p>
+      <w:pPr>
+        <w:rPr>
+          <w:sz w:val="36"/>
+          <w:szCs w:val="36"/>
+          <w:lang w:val="ru-RU"/>
+        </w:rPr>
+      </w:pPr>
+    </w:p>
+    <w:p>
+      <w:pPr>
+        <w:rPr>
+          <w:sz w:val="36"/>
+          <w:szCs w:val="36"/>
+          <w:lang w:val="ru-RU"/>
+        </w:rPr>
+      </w:pPr>
+    </w:p>
+    <w:p>
+      <w:pPr>
         <w:jc w:val="center"/>
         <w:rPr>
           <w:rFonts w:ascii="Times New Roman" w:hAnsi="Times New Roman" w:cs="Times New Roman"/>
@@ -1715,33 +1602,15 @@
           <w:sz w:val="28"/>
           <w:szCs w:val="28"/>
         </w:rPr>
-        <w:t xml:space="preserve">, адаптированного </w:t>
-      </w:r>
-      <w:proofErr w:type="spellStart"/>
+        <w:t xml:space="preserve">, адаптированного под </w:t>
+      </w:r>
       <w:r>
         <w:rPr>
           <w:color w:val="0F1115"/>
           <w:sz w:val="28"/>
           <w:szCs w:val="28"/>
         </w:rPr>
-        <w:t xml:space="preserve">под </w:t>
-      </w:r>
-      <w:r>
-        <w:rPr>
-          <w:color w:val="0F1115"/>
-          <w:sz w:val="28"/>
-          <w:szCs w:val="28"/>
-        </w:rPr>
-        <w:t>конкретные</w:t>
-      </w:r>
-      <w:proofErr w:type="spellEnd"/>
-      <w:r>
-        <w:rPr>
-          <w:color w:val="0F1115"/>
-          <w:sz w:val="28"/>
-          <w:szCs w:val="28"/>
-        </w:rPr>
-        <w:t xml:space="preserve"> предпочтения пользователя</w:t>
+        <w:t>конкретные предпочтения пользователя</w:t>
       </w:r>
       <w:r>
         <w:rPr>
@@ -2844,51 +2713,7 @@
           <w:shd w:val="clear" w:color="auto" w:fill="FFFFFF"/>
           <w:lang w:val="ru-RU"/>
         </w:rPr>
-        <w:t xml:space="preserve">рис. </w:t>
-      </w:r>
-      <w:r>
-        <w:rPr>
-          <w:rFonts w:ascii="Times New Roman" w:hAnsi="Times New Roman" w:cs="Times New Roman"/>
-          <w:color w:val="333333"/>
-          <w:sz w:val="28"/>
-          <w:szCs w:val="28"/>
-          <w:shd w:val="clear" w:color="auto" w:fill="FFFFFF"/>
-          <w:lang w:val="ru-RU"/>
-        </w:rPr>
-        <w:t>1</w:t>
-      </w:r>
-      <w:r>
-        <w:rPr>
-          <w:rFonts w:ascii="Times New Roman" w:hAnsi="Times New Roman" w:cs="Times New Roman"/>
-          <w:color w:val="333333"/>
-          <w:sz w:val="28"/>
-          <w:szCs w:val="28"/>
-          <w:shd w:val="clear" w:color="auto" w:fill="FFFFFF"/>
-          <w:lang w:val="ru-RU"/>
-        </w:rPr>
-        <w:t xml:space="preserve">, рис. </w:t>
-      </w:r>
-      <w:r>
-        <w:rPr>
-          <w:rFonts w:ascii="Times New Roman" w:hAnsi="Times New Roman" w:cs="Times New Roman"/>
-          <w:color w:val="333333"/>
-          <w:sz w:val="28"/>
-          <w:szCs w:val="28"/>
-          <w:shd w:val="clear" w:color="auto" w:fill="FFFFFF"/>
-          <w:lang w:val="ru-RU"/>
-        </w:rPr>
-        <w:t>2</w:t>
-      </w:r>
-      <w:r>
-        <w:rPr>
-          <w:rFonts w:ascii="Times New Roman" w:hAnsi="Times New Roman" w:cs="Times New Roman"/>
-          <w:color w:val="333333"/>
-          <w:sz w:val="28"/>
-          <w:szCs w:val="28"/>
-          <w:shd w:val="clear" w:color="auto" w:fill="FFFFFF"/>
-          <w:lang w:val="ru-RU"/>
-        </w:rPr>
-        <w:t>)</w:t>
+        <w:t>рис. 1, рис. 2)</w:t>
       </w:r>
     </w:p>
     <w:p>
@@ -3753,62 +3578,7 @@
           <w:shd w:val="clear" w:color="auto" w:fill="FFFFFF"/>
           <w:lang w:val="ru-RU"/>
         </w:rPr>
-        <w:t xml:space="preserve"> </w:t>
-      </w:r>
-      <w:r>
-        <w:rPr>
-          <w:rFonts w:ascii="Times New Roman" w:hAnsi="Times New Roman" w:cs="Times New Roman"/>
-          <w:color w:val="333333"/>
-          <w:sz w:val="28"/>
-          <w:szCs w:val="28"/>
-          <w:shd w:val="clear" w:color="auto" w:fill="FFFFFF"/>
-          <w:lang w:val="ru-RU"/>
-        </w:rPr>
-        <w:t xml:space="preserve">(рис. </w:t>
-      </w:r>
-      <w:r>
-        <w:rPr>
-          <w:rFonts w:ascii="Times New Roman" w:hAnsi="Times New Roman" w:cs="Times New Roman"/>
-          <w:color w:val="333333"/>
-          <w:sz w:val="28"/>
-          <w:szCs w:val="28"/>
-          <w:shd w:val="clear" w:color="auto" w:fill="FFFFFF"/>
-          <w:lang w:val="ru-RU"/>
-        </w:rPr>
-        <w:t>3</w:t>
-      </w:r>
-      <w:r>
-        <w:rPr>
-          <w:rFonts w:ascii="Times New Roman" w:hAnsi="Times New Roman" w:cs="Times New Roman"/>
-          <w:color w:val="333333"/>
-          <w:sz w:val="28"/>
-          <w:szCs w:val="28"/>
-          <w:shd w:val="clear" w:color="auto" w:fill="FFFFFF"/>
-          <w:lang w:val="ru-RU"/>
-        </w:rPr>
-        <w:t xml:space="preserve">, рис. </w:t>
-      </w:r>
-      <w:r>
-        <w:rPr>
-          <w:rFonts w:ascii="Times New Roman" w:hAnsi="Times New Roman" w:cs="Times New Roman"/>
-          <w:color w:val="333333"/>
-          <w:sz w:val="28"/>
-          <w:szCs w:val="28"/>
-          <w:shd w:val="clear" w:color="auto" w:fill="FFFFFF"/>
-          <w:lang w:val="ru-RU"/>
-        </w:rPr>
-        <w:t>4</w:t>
-      </w:r>
-      <w:r>
-        <w:rPr>
-          <w:rFonts w:ascii="Times New Roman" w:hAnsi="Times New Roman" w:cs="Times New Roman"/>
-          <w:color w:val="333333"/>
-          <w:sz w:val="28"/>
-          <w:szCs w:val="28"/>
-          <w:shd w:val="clear" w:color="auto" w:fill="FFFFFF"/>
-          <w:lang w:val="ru-RU"/>
-        </w:rPr>
-        <w:t>)</w:t>
+        <w:t xml:space="preserve"> (рис. 3, рис. 4)</w:t>
       </w:r>
     </w:p>
     <w:p>
@@ -4773,7 +4543,7 @@
           <w:lang w:val="ru-RU"/>
         </w:rPr>
         <w:drawing>
-          <wp:inline distT="0" distB="0" distL="0" distR="0" wp14:anchorId="5B9ED7F2" wp14:editId="5F08B8BA">
+          <wp:inline distT="0" distB="0" distL="0" distR="0" wp14:anchorId="5B9ED7F2" wp14:editId="1FC31DD2">
             <wp:extent cx="2100943" cy="1905517"/>
             <wp:effectExtent l="0" t="0" r="0" b="0"/>
             <wp:docPr id="5" name="Рисунок 5"/>
@@ -8769,40 +8539,7 @@
           <w:shd w:val="clear" w:color="auto" w:fill="FFFFFF"/>
           <w:lang w:val="ru-RU"/>
         </w:rPr>
-        <w:t xml:space="preserve"> - </w:t>
-      </w:r>
-      <w:r>
-        <w:rPr>
-          <w:rFonts w:ascii="Times New Roman" w:hAnsi="Times New Roman" w:cs="Times New Roman"/>
-          <w:color w:val="333333"/>
-          <w:sz w:val="28"/>
-          <w:szCs w:val="28"/>
-          <w:shd w:val="clear" w:color="auto" w:fill="FFFFFF"/>
-          <w:lang w:val="ru-RU"/>
-        </w:rPr>
-        <w:t xml:space="preserve">устройство для </w:t>
-      </w:r>
-      <w:r>
-        <w:rPr>
-          <w:rFonts w:ascii="Times New Roman" w:hAnsi="Times New Roman" w:cs="Times New Roman"/>
-          <w:color w:val="333333"/>
-          <w:sz w:val="28"/>
-          <w:szCs w:val="28"/>
-          <w:shd w:val="clear" w:color="auto" w:fill="FFFFFF"/>
-          <w:lang w:val="ru-RU"/>
-        </w:rPr>
-        <w:t>вывода</w:t>
-      </w:r>
-      <w:r>
-        <w:rPr>
-          <w:rFonts w:ascii="Times New Roman" w:hAnsi="Times New Roman" w:cs="Times New Roman"/>
-          <w:color w:val="333333"/>
-          <w:sz w:val="28"/>
-          <w:szCs w:val="28"/>
-          <w:shd w:val="clear" w:color="auto" w:fill="FFFFFF"/>
-          <w:lang w:val="ru-RU"/>
-        </w:rPr>
-        <w:t xml:space="preserve"> звука при устном диалоге</w:t>
+        <w:t xml:space="preserve"> - устройство для вывода звука при устном диалоге</w:t>
       </w:r>
     </w:p>
     <w:p>
@@ -9282,18 +9019,7 @@
           <w:shd w:val="clear" w:color="auto" w:fill="FFFFFF"/>
           <w:lang w:val="ru-RU"/>
         </w:rPr>
-        <w:t>Fronten</w:t>
-      </w:r>
-      <w:r>
-        <w:rPr>
-          <w:rFonts w:ascii="Times New Roman" w:hAnsi="Times New Roman" w:cs="Times New Roman"/>
-          <w:color w:val="333333"/>
-          <w:sz w:val="28"/>
-          <w:szCs w:val="28"/>
-          <w:shd w:val="clear" w:color="auto" w:fill="FFFFFF"/>
-          <w:lang w:val="ru-RU"/>
-        </w:rPr>
-        <w:t>d</w:t>
+        <w:t>Frontend</w:t>
       </w:r>
       <w:proofErr w:type="spellEnd"/>
       <w:r>
@@ -9387,18 +9113,7 @@
           <w:shd w:val="clear" w:color="auto" w:fill="FFFFFF"/>
           <w:lang w:val="ru-RU"/>
         </w:rPr>
-        <w:t xml:space="preserve"> </w:t>
-      </w:r>
-      <w:r>
-        <w:rPr>
-          <w:rFonts w:ascii="Times New Roman" w:hAnsi="Times New Roman" w:cs="Times New Roman"/>
-          <w:color w:val="333333"/>
-          <w:sz w:val="28"/>
-          <w:szCs w:val="28"/>
-          <w:shd w:val="clear" w:color="auto" w:fill="FFFFFF"/>
-          <w:lang w:val="ru-RU"/>
-        </w:rPr>
-        <w:t xml:space="preserve">— </w:t>
+        <w:t xml:space="preserve"> — </w:t>
       </w:r>
       <w:r>
         <w:rPr>
@@ -9526,21 +9241,8 @@
           <w:shd w:val="clear" w:color="auto" w:fill="FFFFFF"/>
           <w:lang w:val="ru-RU"/>
         </w:rPr>
-        <w:t xml:space="preserve">Базы </w:t>
-      </w:r>
-      <w:proofErr w:type="spellStart"/>
-      <w:r>
-        <w:rPr>
-          <w:rFonts w:ascii="Times New Roman" w:hAnsi="Times New Roman" w:cs="Times New Roman"/>
-          <w:color w:val="333333"/>
-          <w:sz w:val="28"/>
-          <w:szCs w:val="28"/>
-          <w:shd w:val="clear" w:color="auto" w:fill="FFFFFF"/>
-          <w:lang w:val="ru-RU"/>
-        </w:rPr>
-        <w:t>данных</w:t>
-      </w:r>
-      <w:proofErr w:type="spellEnd"/>
+        <w:t>Базы данных</w:t>
+      </w:r>
       <w:r>
         <w:rPr>
           <w:rFonts w:ascii="Times New Roman" w:hAnsi="Times New Roman" w:cs="Times New Roman"/>
@@ -13442,25 +13144,7 @@
             <w:sz w:val="28"/>
             <w:szCs w:val="28"/>
           </w:rPr>
-          <w:t>https://swiforce.com/ru/ai-smart-pos-retailtec</w:t>
-        </w:r>
-        <w:r>
-          <w:rPr>
-            <w:rStyle w:val="a9"/>
-            <w:rFonts w:ascii="Times New Roman" w:hAnsi="Times New Roman" w:cs="Times New Roman"/>
-            <w:sz w:val="28"/>
-            <w:szCs w:val="28"/>
-          </w:rPr>
-          <w:t>h</w:t>
-        </w:r>
-        <w:r>
-          <w:rPr>
-            <w:rStyle w:val="a9"/>
-            <w:rFonts w:ascii="Times New Roman" w:hAnsi="Times New Roman" w:cs="Times New Roman"/>
-            <w:sz w:val="28"/>
-            <w:szCs w:val="28"/>
-          </w:rPr>
-          <w:t>-experience/</w:t>
+          <w:t>https://swiforce.com/ru/ai-smart-pos-retailtech-experience/</w:t>
         </w:r>
       </w:hyperlink>
     </w:p>
@@ -13805,17 +13489,7 @@
             <w:sz w:val="28"/>
             <w:szCs w:val="28"/>
           </w:rPr>
-          <w:t>r</w:t>
-        </w:r>
-        <w:r>
-          <w:rPr>
-            <w:rStyle w:val="a9"/>
-            <w:rFonts w:ascii="Times New Roman" w:hAnsi="Times New Roman" w:cs="Times New Roman"/>
-            <w:color w:val="000000" w:themeColor="text1"/>
-            <w:sz w:val="28"/>
-            <w:szCs w:val="28"/>
-          </w:rPr>
-          <w:t>evolutionizing</w:t>
+          <w:t>revolutionizing</w:t>
         </w:r>
         <w:r>
           <w:rPr>

</xml_diff>